<commit_message>
Prepare for Prof. Kong's next reply: layout with figures and tables after the References, captions in her form, OLS and SEC spelled out, finance references restored, prediction model and scenario plan, all copies rebuilt
Co-Authored-By: Claude Sonnet 5.5 <noreply@anthropic.com>
Claude-Session: https://claude.ai/code/session_01XxH9J9TaLYfAYFCaGAqS9y
</commit_message>
<xml_diff>
--- a/papers/thesis_2026-10/reading/thesis_condensed_2026-10-25.docx
+++ b/papers/thesis_2026-10/reading/thesis_condensed_2026-10-25.docx
@@ -653,7 +653,7 @@
         <w:pStyle w:val="BodyText"/>
       </w:pPr>
       <w:r>
-        <w:t xml:space="preserve">Tax research explains why such records matter. Reports from third parties improve compliance. In Denmark, evasion was close to zero on income that employers and banks reported, and substantial on income that taxpayers reported themselves (Kleven et al. 2011). In Chile, the paper trail of the value-added tax deters evasion, and enforcement spreads up the supply chain (Pomeranz 2015). In Brazil, rewards for asking for receipts raised the sales that firms reported (Naritomi 2019). Digital records can also hold information that conventional records lack (Berg, Burg, Gombovic and Puri 2020).</w:t>
+        <w:t xml:space="preserve">Tax research explains why such records matter. Reports from third parties improve compliance. In Denmark, evasion was close to zero on income that employers and banks reported, and substantial on income that taxpayers reported themselves (Kleven et al. 2011). In Chile, the paper trail of the value-added tax deters evasion, and enforcement spreads up the supply chain (Pomeranz 2015). In Brazil, rewards for asking for receipts raised the sales that firms reported (Naritomi 2019). Digital records can also hold information that conventional records lack (Berg, Burg, Gombovic and Puri 2020), and platform-mediated activity can create traces outside conventional records (Barrios, Hochberg and Yi 2022; Denes, Lagaras and Tsoutsoura 2025).</w:t>
       </w:r>
     </w:p>
     <w:p>
@@ -1897,7 +1897,7 @@
         <w:pStyle w:val="FirstParagraph"/>
       </w:pPr>
       <w:r>
-        <w:t xml:space="preserve">H1 is tested in two ways. The first is equation (6): revenue growth is regressed on transaction value growth, and H1 holds in a group if the slope is 1. The second compares the size of yearly changes in the take rate, measured as simple percentage changes, between two groups. One group is the Indonesian and regional platforms. The other is listed platforms abroad, where revenue and transaction value broadly move together. A slope far below 1 in Indonesia, or changes far larger in Indonesia than abroad, would count against H1. Chapter 4 describes the two groups and the tests.</w:t>
+        <w:t xml:space="preserve">H1 is tested in two ways. The first is equation (6), an ordinary least squares (OLS) regression of revenue growth on transaction value growth, and H1 holds in a group if the slope is 1. The second compares the size of yearly changes in the take rate, measured as simple percentage changes, between two groups. One group is the Indonesian and regional platforms. The other is listed platforms abroad, where revenue and transaction value broadly move together. A slope far below 1 in Indonesia, or changes far larger in Indonesia than abroad, would count against H1. Chapter 4 describes the two groups and the tests.</w:t>
       </w:r>
     </w:p>
     <w:p>
@@ -2981,7 +2981,7 @@
         <w:pStyle w:val="BodyText"/>
       </w:pPr>
       <w:r>
-        <w:t xml:space="preserve">The World Bank indicators, the Bank for International Settlements policy rates and the total assets from SEC filings are public. The repository holds the downloaded values and the scripts that fetched them. Three sources are licensed and are not in the repository: the BPS survey files, the LSEG market values and the World Bank survey files. The repository records the size and checksum of each file, so anyone who obtains the same files can check them. It holds the code and the national totals it produces, and no business-level record. BPS is cited as the source of every survey figure, in line with the data-use agreement. Chapter 7 states what these data cannot show.</w:t>
+        <w:t xml:space="preserve">The World Bank indicators, the Bank for International Settlements policy rates and the total assets from the filings with the US Securities and Exchange Commission are public. The repository holds the downloaded values and the scripts that fetched them. Three sources are licensed and are not in the repository: the BPS survey files, the LSEG market values and the World Bank survey files. The repository records the size and checksum of each file, so anyone who obtains the same files can check them. It holds the code and the national totals it produces, and no business-level record. BPS is cited as the source of every survey figure, in line with the data-use agreement. Chapter 7 states what these data cannot show.</w:t>
       </w:r>
     </w:p>
     <w:bookmarkEnd w:id="50"/>
@@ -3058,6 +3058,21 @@
           <w:sz w:val="17"/>
         </w:rPr>
         <w:t xml:space="preserve"> The invisible wedge of three platforms, 2023 (US$ billion)</w:t>
+      </w:r>
+    </w:p>
+    <w:p>
+      <w:pPr>
+        <w:pStyle w:val="BodyText"/>
+        <w:keepNext/>
+        <w:spacing w:before="40" w:after="70" w:lineRule="exact" w:line="220"/>
+        <w:jc w:val="left"/>
+      </w:pPr>
+      <w:r>
+        <w:rPr>
+          <w:color w:val="222222"/>
+          <w:sz w:val="16"/>
+        </w:rPr>
+        <w:t xml:space="preserve">This table reports transaction value, revenue, the wedge (transaction value less revenue) and the ecosystem ratio (the wedge divided by revenue) for Tokopedia, Shopee in Indonesia and Grab in Indonesia in 2023. The last column states how each platform’s amounts are obtained. The total row is the sum of the three platforms and is not a national total.</w:t>
       </w:r>
     </w:p>
     <w:tbl>
@@ -13255,7 +13270,7 @@
           <w:color w:val="333333"/>
           <w:sz w:val="15"/>
         </w:rPr>
-        <w:t xml:space="preserve">The take rate and its parts are not regressors, because the ecosystem ratio is one divided by the take rate, minus one. Source: company filings; SEC filings; World Bank; Bank for International Settlements; author’s calculations. Exploratory.</w:t>
+        <w:t xml:space="preserve">The take rate and its parts are not regressors, because the ecosystem ratio is one divided by the take rate, minus one. Source: company filings; filings with the US Securities and Exchange Commission; World Bank; Bank for International Settlements; author’s calculations. Exploratory.</w:t>
       </w:r>
     </w:p>
     <w:p>
@@ -13801,6 +13816,21 @@
         <w:t xml:space="preserve"> The 2023 rise in the count of online sellers (thousands)</w:t>
       </w:r>
     </w:p>
+    <w:p>
+      <w:pPr>
+        <w:pStyle w:val="BodyText"/>
+        <w:keepNext/>
+        <w:spacing w:before="40" w:after="70" w:lineRule="exact" w:line="220"/>
+        <w:jc w:val="left"/>
+      </w:pPr>
+      <w:r>
+        <w:rPr>
+          <w:color w:val="222222"/>
+          <w:sz w:val="16"/>
+        </w:rPr>
+        <w:t xml:space="preserve">This table splits the rise in the number of online sellers between the weighted totals of the two BPS survey files into net entry and earlier sellers who were newly counted. The first column assumes that no seller stopped between the surveys, and the second assumes that sellers stopped at 5 percent a year. The percentages are shares of the rise.</w:t>
+      </w:r>
+    </w:p>
     <w:tbl>
       <w:tblPr>
         <w:tblStyle w:val="Table"/>
@@ -14720,6 +14750,21 @@
         <w:t xml:space="preserve"> Indonesia’s recent rules and what each acts on</w:t>
       </w:r>
     </w:p>
+    <w:p>
+      <w:pPr>
+        <w:pStyle w:val="BodyText"/>
+        <w:keepNext/>
+        <w:spacing w:before="40" w:after="70" w:lineRule="exact" w:line="220"/>
+        <w:jc w:val="left"/>
+      </w:pPr>
+      <w:r>
+        <w:rPr>
+          <w:color w:val="222222"/>
+          <w:sz w:val="16"/>
+        </w:rPr>
+        <w:t xml:space="preserve">This table lists each recent Indonesian rule that bears on the figures in Chapters 4 and 5. For each rule it gives what the rule does, which part of the figures it acts on, the section of Chapter 5 that measures that part, and the status of the legal text when this thesis was written. Amounts in rupiah (Rp) are converted to US dollars in the note.</w:t>
+      </w:r>
+    </w:p>
     <w:tbl>
       <w:tblPr>
         <w:tblStyle w:val="Table"/>
@@ -15929,6 +15974,21 @@
           <w:sz w:val="17"/>
         </w:rPr>
         <w:t xml:space="preserve"> Registered predictions on the 2026 rules</w:t>
+      </w:r>
+    </w:p>
+    <w:p>
+      <w:pPr>
+        <w:pStyle w:val="BodyText"/>
+        <w:keepNext/>
+        <w:spacing w:before="40" w:after="70" w:lineRule="exact" w:line="220"/>
+        <w:jc w:val="left"/>
+      </w:pPr>
+      <w:r>
+        <w:rPr>
+          <w:color w:val="222222"/>
+          <w:sz w:val="16"/>
+        </w:rPr>
+        <w:t xml:space="preserve">This table lists the registered predictions on the 2026 rules. For each prediction it gives what is expected, the rule it bears on and the date it is scored. The outcome stays blank until the company or BPS releases the figure.</w:t>
       </w:r>
     </w:p>
     <w:tbl>

</xml_diff>